<commit_message>
Rotate demo passwords; remove demo creds from login pages; marketing fixes
</commit_message>
<xml_diff>
--- a/TEST-SCRIPT.docx
+++ b/TEST-SCRIPT.docx
@@ -602,7 +602,7 @@
                 <w:sz w:val="18"/>
                 <w:szCs w:val="18"/>
               </w:rPr>
-              <w:t xml:space="preserve">password123</w:t>
+              <w:t xml:space="preserve">MobiCova!Demo-2026</w:t>
             </w:r>
           </w:p>
         </w:tc>
@@ -682,7 +682,7 @@
                 <w:sz w:val="18"/>
                 <w:szCs w:val="18"/>
               </w:rPr>
-              <w:t xml:space="preserve">password123</w:t>
+              <w:t xml:space="preserve">MobiCova!Demo-2026</w:t>
             </w:r>
           </w:p>
         </w:tc>
@@ -762,7 +762,7 @@
                 <w:sz w:val="18"/>
                 <w:szCs w:val="18"/>
               </w:rPr>
-              <w:t xml:space="preserve">password123</w:t>
+              <w:t xml:space="preserve">MobiCova!Demo-2026</w:t>
             </w:r>
           </w:p>
         </w:tc>

</xml_diff>